<commit_message>
remove renv for now
</commit_message>
<xml_diff>
--- a/paper/supplement.docx
+++ b/paper/supplement.docx
@@ -205,7 +205,7 @@
         <w:t xml:space="preserve"> </w:t>
       </w:r>
       <w:r>
-        <w:t xml:space="preserve">3,</w:t>
+        <w:t xml:space="preserve">4,</w:t>
       </w:r>
       <w:r>
         <w:t xml:space="preserve"> </w:t>
@@ -18518,66 +18518,6 @@
       </w:r>
       <w:r>
         <w:t xml:space="preserve">, which treat block membership as a latent variable, select the number of blocks via the Integrated Classification Likelihood (ICL), and return posterior membership probabilities for every site. In S6.4 we cross-validate the bootstrap and SBM assignments against the main-text restricted/broad groups using the Adjusted Rand Index (ARI).</w:t>
-      </w:r>
-    </w:p>
-    <w:p>
-      <w:pPr>
-        <w:pStyle w:val="BlockText"/>
-      </w:pPr>
-      <w:r>
-        <w:rPr>
-          <w:bCs/>
-          <w:b/>
-        </w:rPr>
-        <w:t xml:space="preserve">Software note.</w:t>
-      </w:r>
-      <w:r>
-        <w:t xml:space="preserve"> </w:t>
-      </w:r>
-      <w:r>
-        <w:t xml:space="preserve">The SBM analyses (S6.3) require the</w:t>
-      </w:r>
-      <w:r>
-        <w:t xml:space="preserve"> </w:t>
-      </w:r>
-      <w:r>
-        <w:rPr>
-          <w:rStyle w:val="VerbatimChar"/>
-        </w:rPr>
-        <w:t xml:space="preserve">blockmodels</w:t>
-      </w:r>
-      <w:r>
-        <w:t xml:space="preserve"> </w:t>
-      </w:r>
-      <w:r>
-        <w:t xml:space="preserve">package, which is not currently in the</w:t>
-      </w:r>
-      <w:r>
-        <w:t xml:space="preserve"> </w:t>
-      </w:r>
-      <w:r>
-        <w:rPr>
-          <w:rStyle w:val="VerbatimChar"/>
-        </w:rPr>
-        <w:t xml:space="preserve">renv</w:t>
-      </w:r>
-      <w:r>
-        <w:t xml:space="preserve"> </w:t>
-      </w:r>
-      <w:r>
-        <w:t xml:space="preserve">lockfile. Before rendering this section, run</w:t>
-      </w:r>
-      <w:r>
-        <w:t xml:space="preserve"> </w:t>
-      </w:r>
-      <w:r>
-        <w:rPr>
-          <w:rStyle w:val="VerbatimChar"/>
-        </w:rPr>
-        <w:t xml:space="preserve">renv::install("blockmodels")</w:t>
-      </w:r>
-      <w:r>
-        <w:t xml:space="preserve">. The bootstrap analyses (S6.2) use only packages already loaded above, so they render regardless.</w:t>
       </w:r>
     </w:p>
     <w:bookmarkEnd w:id="86"/>

</xml_diff>